<commit_message>
Updated docx and ppt
</commit_message>
<xml_diff>
--- a/Documentation/Project_Documentation.docx
+++ b/Documentation/Project_Documentation.docx
@@ -732,6 +732,20 @@
     <w:p>
       <w:pPr>
         <w:pStyle w:val="Compact"/>
+      </w:pPr>
+      <w:r>
+        <w:rPr>
+          <w:b/>
+        </w:rPr>
+        <w:t>Key dependencies:</w:t>
+      </w:r>
+      <w:r>
+        <w:t xml:space="preserve"> backend on ASP.NET Core Identity + JWT Bearer for auth, EF Core 10 with the Npgsql.EntityFrameworkCore.PostgreSQL provider, xUnit for the integration tests. Frontend on React 19, React Router 7, Tailwind CSS 4 and Vite, with Cypress for the e2e tests.</w:t>
+      </w:r>
+    </w:p>
+    <w:p>
+      <w:pPr>
+        <w:pStyle w:val="Compact"/>
         <w:numPr>
           <w:ilvl w:val="0"/>
           <w:numId w:val="1003"/>
@@ -1618,7 +1632,7 @@
         <w:t xml:space="preserve">server.Tests</w:t>
       </w:r>
       <w:r>
-        <w:t xml:space="preserve"> using an in-memory database. They cover auth, groups, expenses (including the split maths), settlements, receipt photos and the health endpoint. 49 tests, all passing as of 24 Sept.</w:t>
+        <w:t xml:space="preserve"> using an in-memory database. They cover auth, groups, expenses (including the split maths and the edit/delete access checks), settlements, receipt photos and the health endpoint. 61 tests, all passing as of 6 Oct.</w:t>
       </w:r>
     </w:p>
     <w:p>
@@ -1646,26 +1660,7 @@
         <w:t xml:space="preserve">Documentation/Test Cases</w:t>
       </w:r>
       <w:r>
-        <w:t xml:space="preserve">), plus a Cypress e2e test for the authentication page.</w:t>
-      </w:r>
-    </w:p>
-    <w:p>
-      <w:pPr>
-        <w:pStyle w:val="Compact"/>
-        <w:numPr>
-          <w:ilvl w:val="0"/>
-          <w:numId w:val="1009"/>
-        </w:numPr>
-      </w:pPr>
-      <w:r>
-        <w:rPr>
-          <w:b/>
-          <w:bCs/>
-        </w:rPr>
-        <w:t xml:space="preserve">Gap:</w:t>
-      </w:r>
-      <w:r>
-        <w:t xml:space="preserve"> no Cypress tests yet for the newer features like editing expenses, receipts and the group dashboard.</w:t>
+        <w:t>), all passing. Cypress e2e tests now cover authentication, the profile page, groups, the group dashboard, expenses (add, edit, delete and the payer-only access checks), receipts and notifications.</w:t>
       </w:r>
     </w:p>
     <w:p>
@@ -1722,18 +1717,6 @@
       </w:pPr>
       <w:r>
         <w:t xml:space="preserve">Only one receipt photo per expense.</w:t>
-      </w:r>
-    </w:p>
-    <w:p>
-      <w:pPr>
-        <w:pStyle w:val="Compact"/>
-        <w:numPr>
-          <w:ilvl w:val="0"/>
-          <w:numId w:val="1010"/>
-        </w:numPr>
-      </w:pPr>
-      <w:r>
-        <w:t xml:space="preserve">Not much frontend testing on the newer features (see Section 8).</w:t>
       </w:r>
     </w:p>
     <w:bookmarkEnd w:id="22"/>

</xml_diff>

<commit_message>
update context diagram for documentation
</commit_message>
<xml_diff>
--- a/Documentation/Project_Documentation.docx
+++ b/Documentation/Project_Documentation.docx
@@ -1,6 +1,6 @@
 
 <file path=word/document.xml><?xml version="1.0" encoding="utf-8"?>
-<w:document xmlns:wpc="http://schemas.microsoft.com/office/word/2010/wordprocessingCanvas" xmlns:cx="http://schemas.microsoft.com/office/drawing/2014/chartex" xmlns:cx1="http://schemas.microsoft.com/office/drawing/2015/9/8/chartex" xmlns:cx2="http://schemas.microsoft.com/office/drawing/2015/10/21/chartex" xmlns:cx3="http://schemas.microsoft.com/office/drawing/2016/5/9/chartex" xmlns:cx4="http://schemas.microsoft.com/office/drawing/2016/5/10/chartex" xmlns:cx5="http://schemas.microsoft.com/office/drawing/2016/5/11/chartex" xmlns:cx6="http://schemas.microsoft.com/office/drawing/2016/5/12/chartex" xmlns:cx7="http://schemas.microsoft.com/office/drawing/2016/5/13/chartex" xmlns:cx8="http://schemas.microsoft.com/office/drawing/2016/5/14/chartex" xmlns:mc="http://schemas.openxmlformats.org/markup-compatibility/2006" xmlns:m="http://schemas.openxmlformats.org/officeDocument/2006/math" xmlns:aink="http://schemas.microsoft.com/office/drawing/2016/ink" xmlns:am3d="http://schemas.microsoft.com/office/drawing/2017/model3d" xmlns:oel="http://schemas.microsoft.com/office/2019/extlst" xmlns:r="http://schemas.openxmlformats.org/officeDocument/2006/relationships" xmlns:wp14="http://schemas.microsoft.com/office/word/2010/wordprocessingDrawing" xmlns:wp="http://schemas.openxmlformats.org/drawingml/2006/wordprocessingDrawing" xmlns:wpg="http://schemas.microsoft.com/office/word/2010/wordprocessingGroup" xmlns:wpi="http://schemas.microsoft.com/office/word/2010/wordprocessingInk" xmlns:wps="http://schemas.microsoft.com/office/word/2010/wordprocessingShape" xmlns:o="urn:schemas-microsoft-com:office:office" xmlns:v="urn:schemas-microsoft-com:vml" xmlns:w10="urn:schemas-microsoft-com:office:word" xmlns:w="http://schemas.openxmlformats.org/wordprocessingml/2006/main" xmlns:w14="http://schemas.microsoft.com/office/word/2010/wordml" xmlns:w15="http://schemas.microsoft.com/office/word/2012/wordml" xmlns:w16cex="http://schemas.microsoft.com/office/word/2018/wordml/cex" xmlns:w16cid="http://schemas.microsoft.com/office/word/2016/wordml/cid" xmlns:w16="http://schemas.microsoft.com/office/word/2018/wordml" xmlns:w16sdtdh="http://schemas.microsoft.com/office/word/2020/wordml/sdtdatahash" xmlns:w16sdtfl="http://schemas.microsoft.com/office/word/2024/wordml/sdtformatlock" xmlns:w16se="http://schemas.microsoft.com/office/word/2015/wordml/symex" xmlns:w16du="http://schemas.microsoft.com/office/word/2023/wordml/word16du" xmlns:wne="http://schemas.microsoft.com/office/word/2006/wordml" mc:Ignorable="w14 w15 w16se w16cid w16 w16cex w16sdtdh w16sdtfl w16du wp14">
+<w:document xmlns:wpc="http://schemas.microsoft.com/office/word/2010/wordprocessingCanvas" xmlns:cx="http://schemas.microsoft.com/office/drawing/2014/chartex" xmlns:cx1="http://schemas.microsoft.com/office/drawing/2015/9/8/chartex" xmlns:cx2="http://schemas.microsoft.com/office/drawing/2015/10/21/chartex" xmlns:cx3="http://schemas.microsoft.com/office/drawing/2016/5/9/chartex" xmlns:cx4="http://schemas.microsoft.com/office/drawing/2016/5/10/chartex" xmlns:cx5="http://schemas.microsoft.com/office/drawing/2016/5/11/chartex" xmlns:cx6="http://schemas.microsoft.com/office/drawing/2016/5/12/chartex" xmlns:cx7="http://schemas.microsoft.com/office/drawing/2016/5/13/chartex" xmlns:cx8="http://schemas.microsoft.com/office/drawing/2016/5/14/chartex" xmlns:mc="http://schemas.openxmlformats.org/markup-compatibility/2006" xmlns:aink="http://schemas.microsoft.com/office/drawing/2016/ink" xmlns:am3d="http://schemas.microsoft.com/office/drawing/2017/model3d" xmlns:o="urn:schemas-microsoft-com:office:office" xmlns:oel="http://schemas.microsoft.com/office/2019/extlst" xmlns:r="http://schemas.openxmlformats.org/officeDocument/2006/relationships" xmlns:m="http://schemas.openxmlformats.org/officeDocument/2006/math" xmlns:v="urn:schemas-microsoft-com:vml" xmlns:wp14="http://schemas.microsoft.com/office/word/2010/wordprocessingDrawing" xmlns:wp="http://schemas.openxmlformats.org/drawingml/2006/wordprocessingDrawing" xmlns:w10="urn:schemas-microsoft-com:office:word" xmlns:w="http://schemas.openxmlformats.org/wordprocessingml/2006/main" xmlns:w14="http://schemas.microsoft.com/office/word/2010/wordml" xmlns:w15="http://schemas.microsoft.com/office/word/2012/wordml" xmlns:w16cex="http://schemas.microsoft.com/office/word/2018/wordml/cex" xmlns:w16cid="http://schemas.microsoft.com/office/word/2016/wordml/cid" xmlns:w16="http://schemas.microsoft.com/office/word/2018/wordml" xmlns:w16du="http://schemas.microsoft.com/office/word/2023/wordml/word16du" xmlns:w16sdtdh="http://schemas.microsoft.com/office/word/2020/wordml/sdtdatahash" xmlns:w16sdtfl="http://schemas.microsoft.com/office/word/2024/wordml/sdtformatlock" xmlns:w16se="http://schemas.microsoft.com/office/word/2015/wordml/symex" xmlns:wpg="http://schemas.microsoft.com/office/word/2010/wordprocessingGroup" xmlns:wpi="http://schemas.microsoft.com/office/word/2010/wordprocessingInk" xmlns:wne="http://schemas.microsoft.com/office/word/2006/wordml" xmlns:wps="http://schemas.microsoft.com/office/word/2010/wordprocessingShape" mc:Ignorable="w14 w15 w16se w16cid w16 w16cex w16sdtdh w16sdtfl w16du wp14">
   <w:body>
     <w:p>
       <w:pPr>
@@ -20,7 +20,7 @@
           <w:color w:val="888888"/>
         </w:rPr>
         <w:drawing>
-          <wp:inline distT="0" distB="0" distL="0" distR="0" wp14:anchorId="32DFAEE4" wp14:editId="08127C82">
+          <wp:inline distT="0" distB="0" distL="0" distR="0" wp14:anchorId="32DFAEE4" wp14:editId="1E3BE449">
             <wp:extent cx="2877226" cy="1031595"/>
             <wp:effectExtent l="63500" t="38100" r="56515" b="73660"/>
             <wp:docPr id="893588569" name="Picture 4"/>
@@ -1498,6 +1498,77 @@
     </w:p>
     <w:p>
       <w:pPr>
+        <w:pStyle w:val="BodyText"/>
+        <w:jc w:val="center"/>
+      </w:pPr>
+      <w:r>
+        <w:drawing>
+          <wp:inline distT="0" distB="0" distL="0" distR="0" wp14:anchorId="189CB2F3" wp14:editId="1D744AAA">
+            <wp:extent cx="4659549" cy="2857458"/>
+            <wp:effectExtent l="0" t="0" r="1905" b="635"/>
+            <wp:docPr id="1240465562" name="Picture 1"/>
+            <wp:cNvGraphicFramePr>
+              <a:graphicFrameLocks xmlns:a="http://schemas.openxmlformats.org/drawingml/2006/main" noChangeAspect="1"/>
+            </wp:cNvGraphicFramePr>
+            <a:graphic xmlns:a="http://schemas.openxmlformats.org/drawingml/2006/main">
+              <a:graphicData uri="http://schemas.openxmlformats.org/drawingml/2006/picture">
+                <pic:pic xmlns:pic="http://schemas.openxmlformats.org/drawingml/2006/picture">
+                  <pic:nvPicPr>
+                    <pic:cNvPr id="1240465562" name=""/>
+                    <pic:cNvPicPr/>
+                  </pic:nvPicPr>
+                  <pic:blipFill>
+                    <a:blip r:embed="rId8"/>
+                    <a:stretch>
+                      <a:fillRect/>
+                    </a:stretch>
+                  </pic:blipFill>
+                  <pic:spPr>
+                    <a:xfrm>
+                      <a:off x="0" y="0"/>
+                      <a:ext cx="4667035" cy="2862049"/>
+                    </a:xfrm>
+                    <a:prstGeom prst="rect">
+                      <a:avLst/>
+                    </a:prstGeom>
+                  </pic:spPr>
+                </pic:pic>
+              </a:graphicData>
+            </a:graphic>
+          </wp:inline>
+        </w:drawing>
+      </w:r>
+    </w:p>
+    <w:p>
+      <w:pPr>
+        <w:pStyle w:val="BodyText"/>
+        <w:jc w:val="center"/>
+        <w:rPr>
+          <w:i/>
+          <w:iCs/>
+        </w:rPr>
+      </w:pPr>
+      <w:proofErr w:type="spellStart"/>
+      <w:r>
+        <w:rPr>
+          <w:rFonts w:ascii="Times New Roman" w:hAnsi="Times New Roman" w:cs="Times New Roman"/>
+          <w:i/>
+          <w:iCs/>
+        </w:rPr>
+        <w:t>SplitSync</w:t>
+      </w:r>
+      <w:proofErr w:type="spellEnd"/>
+      <w:r>
+        <w:rPr>
+          <w:rFonts w:ascii="Times New Roman" w:hAnsi="Times New Roman" w:cs="Times New Roman"/>
+          <w:i/>
+          <w:iCs/>
+        </w:rPr>
+        <w:t xml:space="preserve"> Context Diagram</w:t>
+      </w:r>
+    </w:p>
+    <w:p>
+      <w:pPr>
         <w:pStyle w:val="Compact"/>
         <w:numPr>
           <w:ilvl w:val="0"/>
@@ -1565,6 +1636,7 @@
           <w:b/>
           <w:bCs/>
         </w:rPr>
+        <w:lastRenderedPageBreak/>
         <w:t>Frontend:</w:t>
       </w:r>
       <w:r>
@@ -1784,7 +1856,6 @@
         <w:rPr>
           <w:rFonts w:ascii="Times New Roman" w:hAnsi="Times New Roman" w:cs="Times New Roman"/>
         </w:rPr>
-        <w:lastRenderedPageBreak/>
         <w:t>7. Core Modules</w:t>
       </w:r>
     </w:p>
@@ -2172,6 +2243,7 @@
           <w:rStyle w:val="VerbatimChar"/>
           <w:rFonts w:ascii="Times New Roman" w:hAnsi="Times New Roman" w:cs="Times New Roman"/>
         </w:rPr>
+        <w:lastRenderedPageBreak/>
         <w:t>POST /api/groups/{id}/leave</w:t>
       </w:r>
       <w:r>
@@ -2349,7 +2421,6 @@
           <w:rStyle w:val="VerbatimChar"/>
           <w:rFonts w:ascii="Times New Roman" w:hAnsi="Times New Roman" w:cs="Times New Roman"/>
         </w:rPr>
-        <w:lastRenderedPageBreak/>
         <w:t>GET /api/groups/{groupId}/expenses/{expenseId}/receipt</w:t>
       </w:r>
       <w:r>
@@ -2692,6 +2763,7 @@
         <w:rPr>
           <w:rFonts w:ascii="Times New Roman" w:hAnsi="Times New Roman" w:cs="Times New Roman"/>
         </w:rPr>
+        <w:lastRenderedPageBreak/>
         <w:t>You get a notification when someone adds an expense in your group, records a settlement with you, adds or removes you from a group, or deletes a group you're in.</w:t>
       </w:r>
     </w:p>
@@ -2874,7 +2946,6 @@
         <w:rPr>
           <w:rFonts w:ascii="Times New Roman" w:hAnsi="Times New Roman" w:cs="Times New Roman"/>
         </w:rPr>
-        <w:lastRenderedPageBreak/>
         <w:t xml:space="preserve">Main components: </w:t>
       </w:r>
       <w:r>
@@ -3148,6 +3219,7 @@
           <w:rFonts w:ascii="Times New Roman" w:hAnsi="Times New Roman" w:cs="Times New Roman"/>
           <w:noProof/>
         </w:rPr>
+        <w:lastRenderedPageBreak/>
         <w:drawing>
           <wp:inline distT="0" distB="0" distL="0" distR="0" wp14:anchorId="571F4411" wp14:editId="65831824">
             <wp:extent cx="5486400" cy="2237173"/>
@@ -3164,7 +3236,7 @@
                     <pic:cNvPicPr/>
                   </pic:nvPicPr>
                   <pic:blipFill>
-                    <a:blip r:embed="rId8"/>
+                    <a:blip r:embed="rId9"/>
                     <a:stretch>
                       <a:fillRect/>
                     </a:stretch>
@@ -3212,7 +3284,6 @@
           <w:rFonts w:ascii="Times New Roman" w:hAnsi="Times New Roman" w:cs="Times New Roman"/>
           <w:noProof/>
         </w:rPr>
-        <w:lastRenderedPageBreak/>
         <w:drawing>
           <wp:inline distT="0" distB="0" distL="0" distR="0" wp14:anchorId="7142005B" wp14:editId="0C1496C0">
             <wp:extent cx="5486400" cy="3469856"/>
@@ -3229,7 +3300,7 @@
                     <pic:cNvPicPr/>
                   </pic:nvPicPr>
                   <pic:blipFill>
-                    <a:blip r:embed="rId9"/>
+                    <a:blip r:embed="rId10"/>
                     <a:stretch>
                       <a:fillRect/>
                     </a:stretch>
@@ -3277,6 +3348,7 @@
           <w:rFonts w:ascii="Times New Roman" w:hAnsi="Times New Roman" w:cs="Times New Roman"/>
           <w:noProof/>
         </w:rPr>
+        <w:lastRenderedPageBreak/>
         <w:drawing>
           <wp:inline distT="0" distB="0" distL="0" distR="0" wp14:anchorId="0CE8089D" wp14:editId="3C9F1FBD">
             <wp:extent cx="5486400" cy="3554172"/>
@@ -3293,7 +3365,7 @@
                     <pic:cNvPicPr/>
                   </pic:nvPicPr>
                   <pic:blipFill>
-                    <a:blip r:embed="rId10"/>
+                    <a:blip r:embed="rId11"/>
                     <a:stretch>
                       <a:fillRect/>
                     </a:stretch>
@@ -3341,7 +3413,6 @@
           <w:rFonts w:ascii="Times New Roman" w:hAnsi="Times New Roman" w:cs="Times New Roman"/>
           <w:noProof/>
         </w:rPr>
-        <w:lastRenderedPageBreak/>
         <w:drawing>
           <wp:inline distT="0" distB="0" distL="0" distR="0" wp14:anchorId="3F91720C" wp14:editId="49D10EC6">
             <wp:extent cx="5486400" cy="2978096"/>
@@ -3358,7 +3429,7 @@
                     <pic:cNvPicPr/>
                   </pic:nvPicPr>
                   <pic:blipFill>
-                    <a:blip r:embed="rId11"/>
+                    <a:blip r:embed="rId12"/>
                     <a:stretch>
                       <a:fillRect/>
                     </a:stretch>
@@ -3406,6 +3477,7 @@
           <w:rFonts w:ascii="Times New Roman" w:hAnsi="Times New Roman" w:cs="Times New Roman"/>
           <w:noProof/>
         </w:rPr>
+        <w:lastRenderedPageBreak/>
         <w:drawing>
           <wp:inline distT="0" distB="0" distL="0" distR="0" wp14:anchorId="7430A8A7" wp14:editId="09C30FFF">
             <wp:extent cx="5486400" cy="2544756"/>
@@ -3422,7 +3494,7 @@
                     <pic:cNvPicPr/>
                   </pic:nvPicPr>
                   <pic:blipFill>
-                    <a:blip r:embed="rId12"/>
+                    <a:blip r:embed="rId13"/>
                     <a:stretch>
                       <a:fillRect/>
                     </a:stretch>
@@ -3470,7 +3542,6 @@
           <w:rFonts w:ascii="Times New Roman" w:hAnsi="Times New Roman" w:cs="Times New Roman"/>
           <w:noProof/>
         </w:rPr>
-        <w:lastRenderedPageBreak/>
         <w:drawing>
           <wp:inline distT="0" distB="0" distL="0" distR="0" wp14:anchorId="1B4970BF" wp14:editId="6B771152">
             <wp:extent cx="5486400" cy="2918183"/>
@@ -3487,7 +3558,7 @@
                     <pic:cNvPicPr/>
                   </pic:nvPicPr>
                   <pic:blipFill>
-                    <a:blip r:embed="rId13"/>
+                    <a:blip r:embed="rId14"/>
                     <a:stretch>
                       <a:fillRect/>
                     </a:stretch>
@@ -3552,7 +3623,7 @@
                     <pic:cNvPicPr/>
                   </pic:nvPicPr>
                   <pic:blipFill>
-                    <a:blip r:embed="rId14"/>
+                    <a:blip r:embed="rId15"/>
                     <a:stretch>
                       <a:fillRect/>
                     </a:stretch>
@@ -3617,7 +3688,7 @@
                     <pic:cNvPicPr/>
                   </pic:nvPicPr>
                   <pic:blipFill>
-                    <a:blip r:embed="rId15"/>
+                    <a:blip r:embed="rId16"/>
                     <a:stretch>
                       <a:fillRect/>
                     </a:stretch>
@@ -3681,7 +3752,7 @@
                     <pic:cNvPicPr/>
                   </pic:nvPicPr>
                   <pic:blipFill>
-                    <a:blip r:embed="rId16"/>
+                    <a:blip r:embed="rId17"/>
                     <a:stretch>
                       <a:fillRect/>
                     </a:stretch>
@@ -3779,7 +3850,7 @@
 </file>
 
 <file path=word/numbering.xml><?xml version="1.0" encoding="utf-8"?>
-<w:numbering xmlns:wpc="http://schemas.microsoft.com/office/word/2010/wordprocessingCanvas" xmlns:cx="http://schemas.microsoft.com/office/drawing/2014/chartex" xmlns:cx1="http://schemas.microsoft.com/office/drawing/2015/9/8/chartex" xmlns:cx2="http://schemas.microsoft.com/office/drawing/2015/10/21/chartex" xmlns:cx3="http://schemas.microsoft.com/office/drawing/2016/5/9/chartex" xmlns:cx4="http://schemas.microsoft.com/office/drawing/2016/5/10/chartex" xmlns:cx5="http://schemas.microsoft.com/office/drawing/2016/5/11/chartex" xmlns:cx6="http://schemas.microsoft.com/office/drawing/2016/5/12/chartex" xmlns:cx7="http://schemas.microsoft.com/office/drawing/2016/5/13/chartex" xmlns:cx8="http://schemas.microsoft.com/office/drawing/2016/5/14/chartex" xmlns:mc="http://schemas.openxmlformats.org/markup-compatibility/2006" xmlns:m="http://schemas.openxmlformats.org/officeDocument/2006/math" xmlns:aink="http://schemas.microsoft.com/office/drawing/2016/ink" xmlns:am3d="http://schemas.microsoft.com/office/drawing/2017/model3d" xmlns:oel="http://schemas.microsoft.com/office/2019/extlst" xmlns:r="http://schemas.openxmlformats.org/officeDocument/2006/relationships" xmlns:wp14="http://schemas.microsoft.com/office/word/2010/wordprocessingDrawing" xmlns:wp="http://schemas.openxmlformats.org/drawingml/2006/wordprocessingDrawing" xmlns:wpg="http://schemas.microsoft.com/office/word/2010/wordprocessingGroup" xmlns:wpi="http://schemas.microsoft.com/office/word/2010/wordprocessingInk" xmlns:wps="http://schemas.microsoft.com/office/word/2010/wordprocessingShape" xmlns:o="urn:schemas-microsoft-com:office:office" xmlns:v="urn:schemas-microsoft-com:vml" xmlns:w10="urn:schemas-microsoft-com:office:word" xmlns:w="http://schemas.openxmlformats.org/wordprocessingml/2006/main" xmlns:w14="http://schemas.microsoft.com/office/word/2010/wordml" xmlns:w15="http://schemas.microsoft.com/office/word/2012/wordml" xmlns:w16cex="http://schemas.microsoft.com/office/word/2018/wordml/cex" xmlns:w16cid="http://schemas.microsoft.com/office/word/2016/wordml/cid" xmlns:w16="http://schemas.microsoft.com/office/word/2018/wordml" xmlns:w16sdtdh="http://schemas.microsoft.com/office/word/2020/wordml/sdtdatahash" xmlns:w16sdtfl="http://schemas.microsoft.com/office/word/2024/wordml/sdtformatlock" xmlns:w16se="http://schemas.microsoft.com/office/word/2015/wordml/symex" xmlns:w16du="http://schemas.microsoft.com/office/word/2023/wordml/word16du" xmlns:wne="http://schemas.microsoft.com/office/word/2006/wordml" mc:Ignorable="w14 w15 w16se w16cid w16 w16cex w16sdtdh w16sdtfl w16du wp14">
+<w:numbering xmlns:wpc="http://schemas.microsoft.com/office/word/2010/wordprocessingCanvas" xmlns:cx="http://schemas.microsoft.com/office/drawing/2014/chartex" xmlns:cx1="http://schemas.microsoft.com/office/drawing/2015/9/8/chartex" xmlns:cx2="http://schemas.microsoft.com/office/drawing/2015/10/21/chartex" xmlns:cx3="http://schemas.microsoft.com/office/drawing/2016/5/9/chartex" xmlns:cx4="http://schemas.microsoft.com/office/drawing/2016/5/10/chartex" xmlns:cx5="http://schemas.microsoft.com/office/drawing/2016/5/11/chartex" xmlns:cx6="http://schemas.microsoft.com/office/drawing/2016/5/12/chartex" xmlns:cx7="http://schemas.microsoft.com/office/drawing/2016/5/13/chartex" xmlns:cx8="http://schemas.microsoft.com/office/drawing/2016/5/14/chartex" xmlns:mc="http://schemas.openxmlformats.org/markup-compatibility/2006" xmlns:aink="http://schemas.microsoft.com/office/drawing/2016/ink" xmlns:am3d="http://schemas.microsoft.com/office/drawing/2017/model3d" xmlns:o="urn:schemas-microsoft-com:office:office" xmlns:oel="http://schemas.microsoft.com/office/2019/extlst" xmlns:r="http://schemas.openxmlformats.org/officeDocument/2006/relationships" xmlns:m="http://schemas.openxmlformats.org/officeDocument/2006/math" xmlns:v="urn:schemas-microsoft-com:vml" xmlns:wp14="http://schemas.microsoft.com/office/word/2010/wordprocessingDrawing" xmlns:wp="http://schemas.openxmlformats.org/drawingml/2006/wordprocessingDrawing" xmlns:w10="urn:schemas-microsoft-com:office:word" xmlns:w="http://schemas.openxmlformats.org/wordprocessingml/2006/main" xmlns:w14="http://schemas.microsoft.com/office/word/2010/wordml" xmlns:w15="http://schemas.microsoft.com/office/word/2012/wordml" xmlns:w16cex="http://schemas.microsoft.com/office/word/2018/wordml/cex" xmlns:w16cid="http://schemas.microsoft.com/office/word/2016/wordml/cid" xmlns:w16="http://schemas.microsoft.com/office/word/2018/wordml" xmlns:w16du="http://schemas.microsoft.com/office/word/2023/wordml/word16du" xmlns:w16sdtdh="http://schemas.microsoft.com/office/word/2020/wordml/sdtdatahash" xmlns:w16sdtfl="http://schemas.microsoft.com/office/word/2024/wordml/sdtformatlock" xmlns:w16se="http://schemas.microsoft.com/office/word/2015/wordml/symex" xmlns:wpg="http://schemas.microsoft.com/office/word/2010/wordprocessingGroup" xmlns:wpi="http://schemas.microsoft.com/office/word/2010/wordprocessingInk" xmlns:wne="http://schemas.microsoft.com/office/word/2006/wordml" xmlns:wps="http://schemas.microsoft.com/office/word/2010/wordprocessingShape" mc:Ignorable="w14 w15 w16se w16cid w16 w16cex w16sdtdh w16sdtfl w16du wp14">
   <w:abstractNum w:abstractNumId="0" w15:restartNumberingAfterBreak="0">
     <w:nsid w:val="0000A990"/>
     <w:multiLevelType w:val="multilevel"/>
@@ -3998,7 +4069,7 @@
 </file>
 
 <file path=word/styles.xml><?xml version="1.0" encoding="utf-8"?>
-<w:styles xmlns:mc="http://schemas.openxmlformats.org/markup-compatibility/2006" xmlns:r="http://schemas.openxmlformats.org/officeDocument/2006/relationships" xmlns:w="http://schemas.openxmlformats.org/wordprocessingml/2006/main" xmlns:w14="http://schemas.microsoft.com/office/word/2010/wordml" xmlns:w15="http://schemas.microsoft.com/office/word/2012/wordml" xmlns:w16cex="http://schemas.microsoft.com/office/word/2018/wordml/cex" xmlns:w16cid="http://schemas.microsoft.com/office/word/2016/wordml/cid" xmlns:w16="http://schemas.microsoft.com/office/word/2018/wordml" xmlns:w16sdtdh="http://schemas.microsoft.com/office/word/2020/wordml/sdtdatahash" xmlns:w16sdtfl="http://schemas.microsoft.com/office/word/2024/wordml/sdtformatlock" xmlns:w16se="http://schemas.microsoft.com/office/word/2015/wordml/symex" xmlns:w16du="http://schemas.microsoft.com/office/word/2023/wordml/word16du" mc:Ignorable="w14 w15 w16se w16cid w16 w16cex w16sdtdh w16sdtfl w16du">
+<w:styles xmlns:mc="http://schemas.openxmlformats.org/markup-compatibility/2006" xmlns:r="http://schemas.openxmlformats.org/officeDocument/2006/relationships" xmlns:w="http://schemas.openxmlformats.org/wordprocessingml/2006/main" xmlns:w14="http://schemas.microsoft.com/office/word/2010/wordml" xmlns:w15="http://schemas.microsoft.com/office/word/2012/wordml" xmlns:w16cex="http://schemas.microsoft.com/office/word/2018/wordml/cex" xmlns:w16cid="http://schemas.microsoft.com/office/word/2016/wordml/cid" xmlns:w16="http://schemas.microsoft.com/office/word/2018/wordml" xmlns:w16du="http://schemas.microsoft.com/office/word/2023/wordml/word16du" xmlns:w16sdtdh="http://schemas.microsoft.com/office/word/2020/wordml/sdtdatahash" xmlns:w16sdtfl="http://schemas.microsoft.com/office/word/2024/wordml/sdtformatlock" xmlns:w16se="http://schemas.microsoft.com/office/word/2015/wordml/symex" mc:Ignorable="w14 w15 w16se w16cid w16 w16cex w16sdtdh w16sdtfl w16du">
   <w:docDefaults>
     <w:rPrDefault>
       <w:rPr>

</xml_diff>